<commit_message>
One-sheet: reframe portfolio section to board section, page and docx
</commit_message>
<xml_diff>
--- a/SiQ-The-Baseline-Nobody-Handed-You.docx
+++ b/SiQ-The-Baseline-Nobody-Handed-You.docx
@@ -77,7 +77,7 @@
     </w:p>
     <w:p>
       <w:pPr>
-        <w:spacing w:after="40" w:line="240"/>
+        <w:spacing w:after="30" w:line="240"/>
       </w:pPr>
       <w:r>
         <w:rPr>
@@ -95,7 +95,7 @@
     </w:p>
     <w:p>
       <w:pPr>
-        <w:spacing w:after="40" w:line="240"/>
+        <w:spacing w:after="30" w:line="240"/>
       </w:pPr>
       <w:r>
         <w:rPr>
@@ -116,7 +116,7 @@
         <w:pBdr>
           <w:bottom w:val="single" w:color="D8DCE3" w:sz="4" w:space="4"/>
         </w:pBdr>
-        <w:spacing w:after="60" w:before="70"/>
+        <w:spacing w:after="60" w:before="60"/>
       </w:pPr>
       <w:r>
         <w:rPr>
@@ -329,7 +329,7 @@
     </w:tbl>
     <w:p>
       <w:pPr>
-        <w:spacing w:after="40" w:line="240"/>
+        <w:spacing w:after="30" w:line="240"/>
       </w:pPr>
       <w:r>
         <w:rPr>
@@ -342,7 +342,7 @@
           <w:sz w:val="22"/>
           <w:szCs w:val="22"/>
         </w:rPr>
-        <w:t xml:space="preserve">Also available, if you want a narrower first step: the Stack Health Report, 10 business days, reads what you spend on go-to-market software against what actually reaches a revenue decision and returns a single Signal-to-Spend number. It credits 100 percent toward the full assessment within 30 days.</w:t>
+        <w:t xml:space="preserve">Also available: the Stack Health Report, 10 business days, a single Signal-to-Spend number on what your go-to-market software spend actually returns. Credits 100 percent toward the full assessment.</w:t>
       </w:r>
     </w:p>
     <w:p>
@@ -350,7 +350,7 @@
         <w:pBdr>
           <w:bottom w:val="single" w:color="D8DCE3" w:sz="4" w:space="4"/>
         </w:pBdr>
-        <w:spacing w:after="60" w:before="70"/>
+        <w:spacing w:after="60" w:before="60"/>
       </w:pPr>
       <w:r>
         <w:rPr>
@@ -367,7 +367,7 @@
     </w:p>
     <w:p>
       <w:pPr>
-        <w:spacing w:after="40" w:line="240"/>
+        <w:spacing w:after="30" w:line="240"/>
       </w:pPr>
       <w:r>
         <w:rPr>
@@ -385,7 +385,7 @@
     </w:p>
     <w:p>
       <w:pPr>
-        <w:spacing w:after="40" w:line="240"/>
+        <w:spacing w:after="30" w:line="240"/>
       </w:pPr>
       <w:r>
         <w:rPr>
@@ -406,7 +406,7 @@
         <w:pBdr>
           <w:bottom w:val="single" w:color="D8DCE3" w:sz="4" w:space="4"/>
         </w:pBdr>
-        <w:spacing w:after="60" w:before="70"/>
+        <w:spacing w:after="60" w:before="60"/>
       </w:pPr>
       <w:r>
         <w:rPr>
@@ -423,7 +423,7 @@
     </w:p>
     <w:p>
       <w:pPr>
-        <w:spacing w:after="40" w:line="240"/>
+        <w:spacing w:after="30" w:line="240"/>
       </w:pPr>
       <w:r>
         <w:rPr>
@@ -444,7 +444,7 @@
         <w:pBdr>
           <w:bottom w:val="single" w:color="D8DCE3" w:sz="4" w:space="4"/>
         </w:pBdr>
-        <w:spacing w:after="60" w:before="70"/>
+        <w:spacing w:after="60" w:before="60"/>
       </w:pPr>
       <w:r>
         <w:rPr>
@@ -456,12 +456,12 @@
           <w:sz w:val="18"/>
           <w:szCs w:val="18"/>
         </w:rPr>
-        <w:t xml:space="preserve">WHY THIS TRAVELS</w:t>
-      </w:r>
-    </w:p>
-    <w:p>
-      <w:pPr>
-        <w:spacing w:after="40" w:line="240"/>
+        <w:t xml:space="preserve">WHY IT HOLDS UP WITH YOUR BOARD</w:t>
+      </w:r>
+    </w:p>
+    <w:p>
+      <w:pPr>
+        <w:spacing w:after="30" w:line="240"/>
       </w:pPr>
       <w:r>
         <w:rPr>
@@ -474,7 +474,7 @@
           <w:sz w:val="22"/>
           <w:szCs w:val="22"/>
         </w:rPr>
-        <w:t xml:space="preserve">Same instrument, same scoring, every company, so the read is comparable across a portfolio without forcing a CRM change on anyone. It is the sequence McKinsey's June 2026 study of 471 PE-backed companies argued for.</w:t>
+        <w:t xml:space="preserve">Nothing in it is a black box, so the findings survive the follow-up questions your board and your sponsor will ask. McKinsey's June 2026 study of 471 PE-backed companies argued for the same sequence: establish where a company actually is before deciding where to invest. Better to walk in with that number than to be handed one.</w:t>
       </w:r>
     </w:p>
     <w:p>
@@ -482,7 +482,7 @@
         <w:pBdr>
           <w:bottom w:val="single" w:color="D8DCE3" w:sz="4" w:space="4"/>
         </w:pBdr>
-        <w:spacing w:after="60" w:before="70"/>
+        <w:spacing w:after="60" w:before="60"/>
       </w:pPr>
       <w:r>
         <w:rPr>
@@ -499,7 +499,7 @@
     </w:p>
     <w:p>
       <w:pPr>
-        <w:spacing w:after="40" w:line="240"/>
+        <w:spacing w:after="30" w:line="240"/>
       </w:pPr>
       <w:r>
         <w:rPr>
@@ -532,7 +532,7 @@
     <w:sectPr>
       <w:footerReference w:type="default" r:id="rId7"/>
       <w:pgSz w:w="12240" w:h="15840" w:orient="portrait"/>
-      <w:pgMar w:top="1152" w:right="1440" w:bottom="864" w:left="1440" w:header="708" w:footer="708" w:gutter="0"/>
+      <w:pgMar w:top="1152" w:right="1440" w:bottom="792" w:left="1440" w:header="708" w:footer="708" w:gutter="0"/>
       <w:pgNumType/>
       <w:docGrid w:linePitch="360"/>
     </w:sectPr>

</xml_diff>